<commit_message>
docs: re-shot walkthrough (docx/pdf), deck, Loom script, hosting guide, README and HANDOFF for the new model; containers re-verified
Co-Authored-By: Claude Sonnet 5.5 <noreply@anthropic.com>
Claude-Session: https://claude.ai/code/session_01SbRfaJikJiSq218rciPSuz
</commit_message>
<xml_diff>
--- a/docs/Pulse_Test_Walkthrough.docx
+++ b/docs/Pulse_Test_Walkthrough.docx
@@ -1849,7 +1849,7 @@
       <w:r>
         <w:drawing>
           <wp:inline>
-            <wp:extent cx="5334000" cy="361156"/>
+            <wp:extent cx="5334000" cy="363934"/>
             <wp:effectExtent b="0" l="0" r="0" t="0"/>
             <wp:docPr descr="The top bar for an operator. The Admin link only exists for operators." title="" id="21" name="Picture"/>
             <a:graphic>
@@ -1870,7 +1870,7 @@
                   <pic:spPr bwMode="auto">
                     <a:xfrm>
                       <a:off x="0" y="0"/>
-                      <a:ext cx="5334000" cy="361156"/>
+                      <a:ext cx="5334000" cy="363934"/>
                     </a:xfrm>
                     <a:prstGeom prst="rect">
                       <a:avLst/>
@@ -3012,7 +3012,7 @@
         <w:t xml:space="preserve"> </w:t>
       </w:r>
       <w:r>
-        <w:t xml:space="preserve">that many of the top 12 are green or amber. The order is</w:t>
+        <w:t xml:space="preserve">if one of the top 12 is green. The order is</w:t>
       </w:r>
       <w:r>
         <w:t xml:space="preserve"> </w:t>
@@ -3025,7 +3025,7 @@
         <w:t xml:space="preserve">risk × value at risk × urgency</w:t>
       </w:r>
       <w:r>
-        <w:t xml:space="preserve">, so a very large account renewing soon can outrank a riskier small one. Only a handful of accounts (about 7) clear the red threshold at all. Risk on its own is therefore not sorted descending: that is intentional.</w:t>
+        <w:t xml:space="preserve">, so a very large account renewing soon can outrank a riskier small one. Red means at least a 20% chance of a loss within 90 days (about five times an average account’s risk) and amber at least 10%; Northwind has about 50 red and 150 amber accounts. Risk on its own is therefore not sorted descending: that is intentional. The small grey text beside each name is the CRM reference; account names repeat inside a workspace, the reference does not.</w:t>
       </w:r>
     </w:p>
     <w:p>
@@ -3604,7 +3604,7 @@
           <w:b/>
           <w:bCs/>
         </w:rPr>
-        <w:t xml:space="preserve">Driver = Payment friction</w:t>
+        <w:t xml:space="preserve">Driver = Usage decline</w:t>
       </w:r>
       <w:r>
         <w:t xml:space="preserve">.</w:t>
@@ -3619,7 +3619,7 @@
           <wp:inline>
             <wp:extent cx="5334000" cy="3750468"/>
             <wp:effectExtent b="0" l="0" r="0" t="0"/>
-            <wp:docPr descr="Filters combined. Only red accounts whose main driver is Payment friction remain." title="" id="53" name="Picture"/>
+            <wp:docPr descr="Filters combined. Only red accounts whose main driver is Usage decline remain." title="" id="53" name="Picture"/>
             <a:graphic>
               <a:graphicData uri="http://schemas.openxmlformats.org/drawingml/2006/picture">
                 <pic:pic>
@@ -3662,7 +3662,7 @@
         <w:pStyle w:val="ImageCaption"/>
       </w:pPr>
       <w:r>
-        <w:t xml:space="preserve">Filters combined. Only red accounts whose main driver is Payment friction remain.</w:t>
+        <w:t xml:space="preserve">Filters combined. Only red accounts whose main driver is Usage decline remain.</w:t>
       </w:r>
     </w:p>
     <w:p>
@@ -3835,7 +3835,7 @@
           <w:b/>
           <w:bCs/>
         </w:rPr>
-        <w:t xml:space="preserve">9.9% risk · $1,945,627 at risk · mainly Commercial signals</w:t>
+        <w:t xml:space="preserve">67.2% risk · $842,233 at risk · mainly Commercial signals</w:t>
       </w:r>
       <w:r>
         <w:t xml:space="preserve">.</w:t>
@@ -4147,7 +4147,7 @@
           <w:b/>
           <w:bCs/>
         </w:rPr>
-        <w:t xml:space="preserve">14.7% → 9.9% (▼ 4.8 pts)</w:t>
+        <w:t xml:space="preserve">36.8% → 67.2% (▲ 30.4 pts)</w:t>
       </w:r>
       <w:r>
         <w:t xml:space="preserve"> </w:t>
@@ -8159,20 +8159,29 @@
           <w:b/>
           <w:bCs/>
         </w:rPr>
-        <w:t xml:space="preserve">0.29</w:t>
-      </w:r>
-      <w:r>
-        <w:t xml:space="preserve">, against about 0.04 for a trivial baseline and 0.02 for a hand-built heuristic.</w:t>
-      </w:r>
-      <w:r>
-        <w:t xml:space="preserve"> </w:t>
-      </w:r>
-      <w:r>
-        <w:rPr>
-          <w:b/>
-          <w:bCs/>
-        </w:rPr>
-        <w:t xml:space="preserve">ROC-AUC about 0.69.</w:t>
+        <w:t xml:space="preserve">0.5</w:t>
+      </w:r>
+      <w:r>
+        <w:t xml:space="preserve"> </w:t>
+      </w:r>
+      <w:r>
+        <w:t xml:space="preserve">on the latest block (one draw; it moves a lot), against about 0.04 for a trivial baseline and 0.02 for a hand-built heuristic.</w:t>
+      </w:r>
+      <w:r>
+        <w:t xml:space="preserve"> </w:t>
+      </w:r>
+      <w:r>
+        <w:rPr>
+          <w:b/>
+          <w:bCs/>
+        </w:rPr>
+        <w:t xml:space="preserve">ROC-AUC about 0.73</w:t>
+      </w:r>
+      <w:r>
+        <w:t xml:space="preserve"> </w:t>
+      </w:r>
+      <w:r>
+        <w:t xml:space="preserve">on that block.</w:t>
       </w:r>
     </w:p>
     <w:p>
@@ -8213,7 +8222,7 @@
         <w:t xml:space="preserve">leave-one-workspace-out</w:t>
       </w:r>
       <w:r>
-        <w:t xml:space="preserve">: a small new workspace (initech) gets almost nothing from the shared model (ROC-AUC about 0.53).</w:t>
+        <w:t xml:space="preserve">: a small new workspace (initech) gets almost nothing from the shared model (ROC-AUC about 0.46).</w:t>
       </w:r>
     </w:p>
     <w:p>
@@ -8225,6 +8234,47 @@
         </w:numPr>
       </w:pPr>
       <w:r>
+        <w:t xml:space="preserve">✅</w:t>
+      </w:r>
+      <w:r>
+        <w:t xml:space="preserve"> </w:t>
+      </w:r>
+      <w:r>
+        <w:rPr>
+          <w:b/>
+          <w:bCs/>
+        </w:rPr>
+        <w:t xml:space="preserve">Lead time</w:t>
+      </w:r>
+      <w:r>
+        <w:t xml:space="preserve"> </w:t>
+      </w:r>
+      <w:r>
+        <w:t xml:space="preserve">and the</w:t>
+      </w:r>
+      <w:r>
+        <w:t xml:space="preserve"> </w:t>
+      </w:r>
+      <w:r>
+        <w:rPr>
+          <w:b/>
+          <w:bCs/>
+        </w:rPr>
+        <w:t xml:space="preserve">rolling backtest</w:t>
+      </w:r>
+      <w:r>
+        <w:t xml:space="preserve">: ROC-AUC by fold (about 0.62, 0.63, 0.69, 0.71) and, for the amber and red lines, how many of the 390 losses were flagged (about 32% and 14%) and a median of about 70 days ahead.</w:t>
+      </w:r>
+    </w:p>
+    <w:p>
+      <w:pPr>
+        <w:pStyle w:val="Compact"/>
+        <w:numPr>
+          <w:ilvl w:val="0"/>
+          <w:numId w:val="1044"/>
+        </w:numPr>
+      </w:pPr>
+      <w:r>
         <w:t xml:space="preserve">✅ Anything the pipeline could not produce says</w:t>
       </w:r>
       <w:r>
@@ -8241,7 +8291,7 @@
         <w:t xml:space="preserve"> </w:t>
       </w:r>
       <w:r>
-        <w:t xml:space="preserve">with a reason (for example lead time). It is stated, not invented. A CSM gets</w:t>
+        <w:t xml:space="preserve">with a reason. It is stated, not invented. A CSM gets</w:t>
       </w:r>
       <w:r>
         <w:t xml:space="preserve"> </w:t>
@@ -8944,7 +8994,7 @@
         <w:t xml:space="preserve">The weekly queue is dominated by large renewals</w:t>
       </w:r>
       <w:r>
-        <w:t xml:space="preserve">, not only red accounts, by design (risk × value × urgency). Only about 7 accounts are red.</w:t>
+        <w:t xml:space="preserve">, not only red accounts, by design (risk × value × urgency). About 50 Northwind accounts are red and about 150 amber (cut-offs 20% and 10% of calibrated risk, clarifications B-32 and B-33).</w:t>
       </w:r>
     </w:p>
     <w:p>
@@ -9088,7 +9138,7 @@
         <w:t xml:space="preserve"> </w:t>
       </w:r>
       <w:r>
-        <w:t xml:space="preserve">ROC-AUC about 0.69. The two planted</w:t>
+        <w:t xml:space="preserve">rolling ROC-AUC about 0.661, close to the ceiling of about 0.7 for this data. The two planted</w:t>
       </w:r>
       <w:r>
         <w:t xml:space="preserve"> </w:t>
@@ -9100,7 +9150,7 @@
         <w:t xml:space="preserve"> </w:t>
       </w:r>
       <w:r>
-        <w:t xml:space="preserve">accounts are missed, lead time is not reported, and a small new workspace gets little from the shared model.</w:t>
+        <w:t xml:space="preserve">accounts are missed (they are flawed fixtures), about 70% of losses are not flagged at the amber line, and a small new workspace gets little from the shared model.</w:t>
       </w:r>
     </w:p>
     <w:p>

</xml_diff>